<commit_message>
Formalize CIMA capability Word doc for external readers.
Remove internal wording such as recording/demo references and keep a professional user-facing tone.

Co-authored-by: Cursor <cursoragent@cursor.com>
</commit_message>
<xml_diff>
--- a/cima/demo/doc/CIMA专家·能力与使用场景.docx
+++ b/cima/demo/doc/CIMA专家·能力与使用场景.docx
@@ -27,7 +27,7 @@
           <w:b/>
           <w:sz w:val="28"/>
         </w:rPr>
-        <w:t>能力说明、使用场景与演示参考</w:t>
+        <w:t>能力说明与使用指南</w:t>
       </w:r>
     </w:p>
     <w:p>
@@ -45,7 +45,7 @@
     </w:p>
     <w:p>
       <w:pPr>
-        <w:spacing w:before="160" w:after="360"/>
+        <w:spacing w:before="200" w:after="400"/>
         <w:jc w:val="center"/>
       </w:pPr>
       <w:r>
@@ -61,20 +61,6 @@
         <w:t>开源仓库：https://github.com/CNGBdb-org/BioLens-Skill</w:t>
         <w:br/>
         <w:t>公开数据 FTP：https://ftp.cngb.org/pub/SciRAID/trueblood/cima/CIMA_Resource/</w:t>
-      </w:r>
-    </w:p>
-    <w:p>
-      <w:pPr>
-        <w:spacing w:after="320"/>
-        <w:jc w:val="center"/>
-      </w:pPr>
-      <w:r>
-        <w:rPr>
-          <w:rFonts w:ascii="楷体" w:hAnsi="楷体" w:eastAsia="楷体"/>
-          <w:b w:val="0"/>
-          <w:sz w:val="18"/>
-        </w:rPr>
-        <w:t>（依据录制演示材料、HTML 场景文档及 BioLens-Skill 仓库整理）</w:t>
       </w:r>
     </w:p>
     <w:p>
@@ -115,7 +101,7 @@
           <w:b w:val="0"/>
           <w:sz w:val="22"/>
         </w:rPr>
-        <w:t>CIMA 基于 428 名中国成人、千万级外周血免疫细胞的多组学图谱（scRNA + scATAC），并发布 GRN、xQTL、SMR 等预计算结果。本专家能力分为两条主线：一是查询已发布的图谱与预计算表；二是在示例数据或自有 h5ad 上跑通分析流程，降低使用门槛，并与论文及门户资源保持对应。</w:t>
+        <w:t>CIMA 基于 428 名中国成人、千万级外周血免疫细胞的多组学图谱（scRNA + scATAC），并发布 GRN、xQTL、SMR 等预计算结果。本专家能力分为两条主线：一是查询已发布的图谱与预计算表；二是在示例数据或自有 h5ad 上完成分析流程，降低使用门槛，并与论文及门户资源保持对应。</w:t>
       </w:r>
     </w:p>
     <w:p>
@@ -128,7 +114,7 @@
           <w:b/>
           <w:sz w:val="22"/>
         </w:rPr>
-        <w:t>核心规模一览</w:t>
+        <w:t>核心规模</w:t>
       </w:r>
     </w:p>
     <w:tbl>
@@ -343,7 +329,7 @@
                 <w:b w:val="0"/>
                 <w:sz w:val="18"/>
               </w:rPr>
-              <w:t>秒级（预计算表；首次拉取网络除外）</w:t>
+              <w:t>秒级（预计算表；首次网络拉取除外）</w:t>
             </w:r>
           </w:p>
         </w:tc>
@@ -360,7 +346,7 @@
           <w:b/>
           <w:sz w:val="32"/>
         </w:rPr>
-        <w:t>二、为什么需要 CIMA 专家</w:t>
+        <w:t>二、背景与目标</w:t>
       </w:r>
     </w:p>
     <w:p>
@@ -374,7 +360,7 @@
           <w:b w:val="0"/>
           <w:sz w:val="22"/>
         </w:rPr>
-        <w:t>CIMA 门户与公开资源齐全，但日常使用仍常遇到「找不到、问不清、跑不通」等问题：</w:t>
+        <w:t>CIMA 门户与公开资源齐全，但日常使用仍常遇到数据位置不清晰、图谱探索依赖手工操作、预计算表入口不统一，以及本地分析流程门槛较高等问题。</w:t>
       </w:r>
     </w:p>
     <w:p>
@@ -444,7 +430,7 @@
           <w:b w:val="0"/>
           <w:sz w:val="22"/>
         </w:rPr>
-        <w:t>CIMA 专家将上述能力拆分为可安装的 Skills，由 Agent 按问题自动路由，用户无需自行翻目录或记忆命令细节。</w:t>
+        <w:t>CIMA 专家将上述能力拆分为可安装的 Skills，由 Agent 按问题自动路由，用户无需自行翻阅目录或记忆命令细节。</w:t>
       </w:r>
     </w:p>
     <w:p>
@@ -622,7 +608,7 @@
           <w:b/>
           <w:sz w:val="28"/>
         </w:rPr>
-        <w:t>（三）从「重计算」到「即时查询」</w:t>
+        <w:t>（三）从重计算到即时查询</w:t>
       </w:r>
     </w:p>
     <w:tbl>
@@ -1599,7 +1585,7 @@
           <w:b/>
           <w:sz w:val="22"/>
         </w:rPr>
-        <w:t>流水线关系：</w:t>
+        <w:t>流水线关系</w:t>
       </w:r>
     </w:p>
     <w:p>
@@ -1682,7 +1668,7 @@
           <w:b/>
           <w:sz w:val="32"/>
         </w:rPr>
-        <w:t>五、使用场景（录制演示对应）</w:t>
+        <w:t>五、使用场景</w:t>
       </w:r>
     </w:p>
     <w:p>
@@ -1699,12 +1685,9 @@
       </w:r>
     </w:p>
     <w:p>
-      <w:pPr>
-        <w:spacing w:after="120" w:line="300" w:lineRule="auto"/>
-      </w:pPr>
       <w:r>
         <w:rPr>
-          <w:rFonts w:ascii="宋体" w:hAnsi="宋体" w:eastAsia="宋体"/>
+          <w:rFonts w:ascii="黑体" w:hAnsi="黑体" w:eastAsia="黑体"/>
           <w:b/>
           <w:sz w:val="22"/>
         </w:rPr>
@@ -1843,7 +1826,7 @@
           <w:b w:val="0"/>
           <w:sz w:val="22"/>
         </w:rPr>
-        <w:t>响应量级：多数为秒级至分钟级；全量 PBMCs UMAP 出图相对较慢。</w:t>
+        <w:t>响应时间：多数为秒级至分钟级；全量 PBMCs UMAP 出图相对较慢。</w:t>
       </w:r>
     </w:p>
     <w:p>
@@ -1860,12 +1843,9 @@
       </w:r>
     </w:p>
     <w:p>
-      <w:pPr>
-        <w:spacing w:after="120" w:line="300" w:lineRule="auto"/>
-      </w:pPr>
       <w:r>
         <w:rPr>
-          <w:rFonts w:ascii="宋体" w:hAnsi="宋体" w:eastAsia="宋体"/>
+          <w:rFonts w:ascii="黑体" w:hAnsi="黑体" w:eastAsia="黑体"/>
           <w:b/>
           <w:sz w:val="22"/>
         </w:rPr>
@@ -1948,7 +1928,7 @@
           <w:b w:val="0"/>
           <w:sz w:val="22"/>
         </w:rPr>
-        <w:t>响应量级：预计算表查询，通常为秒级（首次拉取表除外）。</w:t>
+        <w:t>响应时间：预计算表查询，通常为秒级（首次拉取表除外）。</w:t>
       </w:r>
     </w:p>
     <w:p>
@@ -1965,12 +1945,9 @@
       </w:r>
     </w:p>
     <w:p>
-      <w:pPr>
-        <w:spacing w:after="120" w:line="300" w:lineRule="auto"/>
-      </w:pPr>
       <w:r>
         <w:rPr>
-          <w:rFonts w:ascii="宋体" w:hAnsi="宋体" w:eastAsia="宋体"/>
+          <w:rFonts w:ascii="黑体" w:hAnsi="黑体" w:eastAsia="黑体"/>
           <w:b/>
           <w:sz w:val="22"/>
         </w:rPr>
@@ -2053,7 +2030,7 @@
           <w:b w:val="0"/>
           <w:sz w:val="22"/>
         </w:rPr>
-        <w:t>响应量级：通常秒级返回 lead 关联（含 p 值、效应大小等）。</w:t>
+        <w:t>响应时间：通常秒级返回 lead 关联（含 p 值、效应大小等）。</w:t>
       </w:r>
     </w:p>
     <w:p>
@@ -2070,12 +2047,9 @@
       </w:r>
     </w:p>
     <w:p>
-      <w:pPr>
-        <w:spacing w:after="120" w:line="300" w:lineRule="auto"/>
-      </w:pPr>
       <w:r>
         <w:rPr>
-          <w:rFonts w:ascii="宋体" w:hAnsi="宋体" w:eastAsia="宋体"/>
+          <w:rFonts w:ascii="黑体" w:hAnsi="黑体" w:eastAsia="黑体"/>
           <w:b/>
           <w:sz w:val="22"/>
         </w:rPr>
@@ -2175,12 +2149,9 @@
       </w:r>
     </w:p>
     <w:p>
-      <w:pPr>
-        <w:spacing w:after="120" w:line="300" w:lineRule="auto"/>
-      </w:pPr>
       <w:r>
         <w:rPr>
-          <w:rFonts w:ascii="宋体" w:hAnsi="宋体" w:eastAsia="宋体"/>
+          <w:rFonts w:ascii="黑体" w:hAnsi="黑体" w:eastAsia="黑体"/>
           <w:b/>
           <w:sz w:val="22"/>
         </w:rPr>
@@ -2236,7 +2207,7 @@
           <w:b w:val="0"/>
           <w:sz w:val="22"/>
         </w:rPr>
-        <w:t>CIMA-CLM 能够完成哪些分析？预计算结果的边界是什么？</w:t>
+        <w:t>CIMA-CLM 能够完成哪些分析？预计算结果的适用范围是什么？</w:t>
       </w:r>
     </w:p>
     <w:p>
@@ -2266,12 +2237,9 @@
       </w:r>
     </w:p>
     <w:p>
-      <w:pPr>
-        <w:spacing w:after="120" w:line="300" w:lineRule="auto"/>
-      </w:pPr>
       <w:r>
         <w:rPr>
-          <w:rFonts w:ascii="宋体" w:hAnsi="宋体" w:eastAsia="宋体"/>
+          <w:rFonts w:ascii="黑体" w:hAnsi="黑体" w:eastAsia="黑体"/>
           <w:b/>
           <w:sz w:val="22"/>
         </w:rPr>
@@ -2289,7 +2257,7 @@
           <w:b w:val="0"/>
           <w:sz w:val="22"/>
         </w:rPr>
-        <w:t>可按论文向流程在 CPU 上完成预处理、注释、多组学整合与 metacell。可使用配套示例数据（paired_demo_rna / paired_demo_atac / paired_demo_atac_gene），或替换为自有 h5ad。</w:t>
+        <w:t>可按论文相关流程在 CPU 上完成预处理、注释、多组学整合与 metacell。可使用配套示例数据（paired_demo_rna / paired_demo_atac / paired_demo_atac_gene），或替换为自有 h5ad。</w:t>
       </w:r>
     </w:p>
     <w:p>
@@ -2354,7 +2322,7 @@
           <w:b w:val="0"/>
           <w:sz w:val="22"/>
         </w:rPr>
-        <w:t>响应量级：通常为数分钟级。</w:t>
+        <w:t>响应时间：通常为数分钟级。</w:t>
       </w:r>
     </w:p>
     <w:p>
@@ -2367,7 +2335,7 @@
           <w:b/>
           <w:sz w:val="32"/>
         </w:rPr>
-        <w:t>六、录制演示推荐问法顺序</w:t>
+        <w:t>六、推荐使用顺序</w:t>
       </w:r>
     </w:p>
     <w:p>
@@ -2380,7 +2348,7 @@
           <w:b w:val="0"/>
           <w:sz w:val="22"/>
         </w:rPr>
-        <w:t>下列顺序适用于约 5 分钟快速演示，覆盖图谱探索、调控、遗传与 CLM 可视化等核心能力（时长为示意，受网络与缓存状态影响）：</w:t>
+        <w:t>建议按下列顺序熟悉主要能力（具体耗时受网络与缓存状态影响）：</w:t>
       </w:r>
     </w:p>
     <w:tbl>
@@ -2391,10 +2359,9 @@
         <w:tblLook w:firstColumn="1" w:firstRow="1" w:lastColumn="0" w:lastRow="0" w:noHBand="0" w:noVBand="1" w:val="04A0"/>
       </w:tblPr>
       <w:tblGrid>
-        <w:gridCol w:w="2351"/>
-        <w:gridCol w:w="2351"/>
-        <w:gridCol w:w="2351"/>
-        <w:gridCol w:w="2351"/>
+        <w:gridCol w:w="3135"/>
+        <w:gridCol w:w="3135"/>
+        <w:gridCol w:w="3135"/>
       </w:tblGrid>
       <w:tr>
         <w:tc>
@@ -2416,7 +2383,7 @@
         </w:tc>
         <w:tc>
           <w:tcPr>
-            <w:tcW w:type="dxa" w:w="3969"/>
+            <w:tcW w:type="dxa" w:w="5102"/>
             <w:shd w:fill="D9E2F3" w:val="clear"/>
           </w:tcPr>
           <w:p>
@@ -2433,7 +2400,7 @@
         </w:tc>
         <w:tc>
           <w:tcPr>
-            <w:tcW w:type="dxa" w:w="2835"/>
+            <w:tcW w:type="dxa" w:w="3118"/>
             <w:shd w:fill="D9E2F3" w:val="clear"/>
           </w:tcPr>
           <w:p>
@@ -2444,24 +2411,7 @@
                 <w:b/>
                 <w:sz w:val="20"/>
               </w:rPr>
-              <w:t>展示重点</w:t>
-            </w:r>
-          </w:p>
-        </w:tc>
-        <w:tc>
-          <w:tcPr>
-            <w:tcW w:type="dxa" w:w="1417"/>
-            <w:shd w:fill="D9E2F3" w:val="clear"/>
-          </w:tcPr>
-          <w:p>
-            <w:r/>
-            <w:r>
-              <w:rPr>
-                <w:rFonts w:ascii="黑体" w:hAnsi="黑体" w:eastAsia="黑体"/>
-                <w:b/>
-                <w:sz w:val="20"/>
-              </w:rPr>
-              <w:t>示意耗时</w:t>
+              <w:t>对应能力</w:t>
             </w:r>
           </w:p>
         </w:tc>
@@ -2485,7 +2435,7 @@
         </w:tc>
         <w:tc>
           <w:tcPr>
-            <w:tcW w:type="dxa" w:w="3969"/>
+            <w:tcW w:type="dxa" w:w="5102"/>
           </w:tcPr>
           <w:p>
             <w:r/>
@@ -2501,7 +2451,7 @@
         </w:tc>
         <w:tc>
           <w:tcPr>
-            <w:tcW w:type="dxa" w:w="2835"/>
+            <w:tcW w:type="dxa" w:w="3118"/>
           </w:tcPr>
           <w:p>
             <w:r/>
@@ -2512,22 +2462,6 @@
                 <w:sz w:val="18"/>
               </w:rPr>
               <w:t>图谱浏览 / 视图列表</w:t>
-            </w:r>
-          </w:p>
-        </w:tc>
-        <w:tc>
-          <w:tcPr>
-            <w:tcW w:type="dxa" w:w="1417"/>
-          </w:tcPr>
-          <w:p>
-            <w:r/>
-            <w:r>
-              <w:rPr>
-                <w:rFonts w:ascii="宋体" w:hAnsi="宋体" w:eastAsia="宋体"/>
-                <w:b w:val="0"/>
-                <w:sz w:val="18"/>
-              </w:rPr>
-              <w:t>约 3 秒</w:t>
             </w:r>
           </w:p>
         </w:tc>
@@ -2551,7 +2485,7 @@
         </w:tc>
         <w:tc>
           <w:tcPr>
-            <w:tcW w:type="dxa" w:w="3969"/>
+            <w:tcW w:type="dxa" w:w="5102"/>
           </w:tcPr>
           <w:p>
             <w:r/>
@@ -2567,7 +2501,7 @@
         </w:tc>
         <w:tc>
           <w:tcPr>
-            <w:tcW w:type="dxa" w:w="2835"/>
+            <w:tcW w:type="dxa" w:w="3118"/>
           </w:tcPr>
           <w:p>
             <w:r/>
@@ -2578,22 +2512,6 @@
                 <w:sz w:val="18"/>
               </w:rPr>
               <w:t>跨谱系基因表达比较</w:t>
-            </w:r>
-          </w:p>
-        </w:tc>
-        <w:tc>
-          <w:tcPr>
-            <w:tcW w:type="dxa" w:w="1417"/>
-          </w:tcPr>
-          <w:p>
-            <w:r/>
-            <w:r>
-              <w:rPr>
-                <w:rFonts w:ascii="宋体" w:hAnsi="宋体" w:eastAsia="宋体"/>
-                <w:b w:val="0"/>
-                <w:sz w:val="18"/>
-              </w:rPr>
-              <w:t>约 5 秒</w:t>
             </w:r>
           </w:p>
         </w:tc>
@@ -2617,7 +2535,7 @@
         </w:tc>
         <w:tc>
           <w:tcPr>
-            <w:tcW w:type="dxa" w:w="3969"/>
+            <w:tcW w:type="dxa" w:w="5102"/>
           </w:tcPr>
           <w:p>
             <w:r/>
@@ -2633,7 +2551,7 @@
         </w:tc>
         <w:tc>
           <w:tcPr>
-            <w:tcW w:type="dxa" w:w="2835"/>
+            <w:tcW w:type="dxa" w:w="3118"/>
           </w:tcPr>
           <w:p>
             <w:r/>
@@ -2644,22 +2562,6 @@
                 <w:sz w:val="18"/>
               </w:rPr>
               <w:t>GRN 预计算查询</w:t>
-            </w:r>
-          </w:p>
-        </w:tc>
-        <w:tc>
-          <w:tcPr>
-            <w:tcW w:type="dxa" w:w="1417"/>
-          </w:tcPr>
-          <w:p>
-            <w:r/>
-            <w:r>
-              <w:rPr>
-                <w:rFonts w:ascii="宋体" w:hAnsi="宋体" w:eastAsia="宋体"/>
-                <w:b w:val="0"/>
-                <w:sz w:val="18"/>
-              </w:rPr>
-              <w:t>约 3 秒</w:t>
             </w:r>
           </w:p>
         </w:tc>
@@ -2683,7 +2585,7 @@
         </w:tc>
         <w:tc>
           <w:tcPr>
-            <w:tcW w:type="dxa" w:w="3969"/>
+            <w:tcW w:type="dxa" w:w="5102"/>
           </w:tcPr>
           <w:p>
             <w:r/>
@@ -2699,7 +2601,7 @@
         </w:tc>
         <w:tc>
           <w:tcPr>
-            <w:tcW w:type="dxa" w:w="2835"/>
+            <w:tcW w:type="dxa" w:w="3118"/>
           </w:tcPr>
           <w:p>
             <w:r/>
@@ -2710,22 +2612,6 @@
                 <w:sz w:val="18"/>
               </w:rPr>
               <w:t>xQTL 预计算查询</w:t>
-            </w:r>
-          </w:p>
-        </w:tc>
-        <w:tc>
-          <w:tcPr>
-            <w:tcW w:type="dxa" w:w="1417"/>
-          </w:tcPr>
-          <w:p>
-            <w:r/>
-            <w:r>
-              <w:rPr>
-                <w:rFonts w:ascii="宋体" w:hAnsi="宋体" w:eastAsia="宋体"/>
-                <w:b w:val="0"/>
-                <w:sz w:val="18"/>
-              </w:rPr>
-              <w:t>约 5 秒</w:t>
             </w:r>
           </w:p>
         </w:tc>
@@ -2749,7 +2635,7 @@
         </w:tc>
         <w:tc>
           <w:tcPr>
-            <w:tcW w:type="dxa" w:w="3969"/>
+            <w:tcW w:type="dxa" w:w="5102"/>
           </w:tcPr>
           <w:p>
             <w:r/>
@@ -2765,7 +2651,7 @@
         </w:tc>
         <w:tc>
           <w:tcPr>
-            <w:tcW w:type="dxa" w:w="2835"/>
+            <w:tcW w:type="dxa" w:w="3118"/>
           </w:tcPr>
           <w:p>
             <w:r/>
@@ -2776,22 +2662,6 @@
                 <w:sz w:val="18"/>
               </w:rPr>
               <w:t>SMR 性状查询</w:t>
-            </w:r>
-          </w:p>
-        </w:tc>
-        <w:tc>
-          <w:tcPr>
-            <w:tcW w:type="dxa" w:w="1417"/>
-          </w:tcPr>
-          <w:p>
-            <w:r/>
-            <w:r>
-              <w:rPr>
-                <w:rFonts w:ascii="宋体" w:hAnsi="宋体" w:eastAsia="宋体"/>
-                <w:b w:val="0"/>
-                <w:sz w:val="18"/>
-              </w:rPr>
-              <w:t>约 5 秒</w:t>
             </w:r>
           </w:p>
         </w:tc>
@@ -2815,7 +2685,7 @@
         </w:tc>
         <w:tc>
           <w:tcPr>
-            <w:tcW w:type="dxa" w:w="3969"/>
+            <w:tcW w:type="dxa" w:w="5102"/>
           </w:tcPr>
           <w:p>
             <w:r/>
@@ -2825,13 +2695,13 @@
                 <w:b w:val="0"/>
                 <w:sz w:val="18"/>
               </w:rPr>
-              <w:t>请运行 CIMA-CLM 变异效应演示并出图。</w:t>
+              <w:t>请运行 CIMA-CLM 变异效应分析并输出图件。</w:t>
             </w:r>
           </w:p>
         </w:tc>
         <w:tc>
           <w:tcPr>
-            <w:tcW w:type="dxa" w:w="2835"/>
+            <w:tcW w:type="dxa" w:w="3118"/>
           </w:tcPr>
           <w:p>
             <w:r/>
@@ -2842,22 +2712,6 @@
                 <w:sz w:val="18"/>
               </w:rPr>
               <w:t>CLM 预计算可视化</w:t>
-            </w:r>
-          </w:p>
-        </w:tc>
-        <w:tc>
-          <w:tcPr>
-            <w:tcW w:type="dxa" w:w="1417"/>
-          </w:tcPr>
-          <w:p>
-            <w:r/>
-            <w:r>
-              <w:rPr>
-                <w:rFonts w:ascii="宋体" w:hAnsi="宋体" w:eastAsia="宋体"/>
-                <w:b w:val="0"/>
-                <w:sz w:val="18"/>
-              </w:rPr>
-              <w:t>约 10 秒</w:t>
             </w:r>
           </w:p>
         </w:tc>

</xml_diff>